<commit_message>
Implement "one-click copy" script feature for video analysis, allowing users to generate new product scripts based on existing analysis results. Update frontend to facilitate user input for product details and highlight content, while integrating backend endpoints for script generation and default selling point recommendations. Enhance documentation to reflect new functionality and user workflow. Add tests to ensure reliability of the new features.
</commit_message>
<xml_diff>
--- a/爆款视频分析方案设计&验证.docx
+++ b/爆款视频分析方案设计&验证.docx
@@ -2894,6 +2894,92 @@
 <file path=word/numbering.xml><?xml version="1.0" encoding="utf-8"?>
 <w:numbering xmlns:w="http://schemas.openxmlformats.org/wordprocessingml/2006/main">
   <w:abstractNum w:abstractNumId="1">
+    <w:lvl w:ilvl="3">
+      <w:start w:val="1"/>
+      <w:numFmt w:val="decimal"/>
+      <w:lvlText w:val="%4."/>
+      <w:lvlJc w:val="left"/>
+      <w:pPr>
+        <w:ind w:left="1656" w:hanging="336"/>
+      </w:pPr>
+    </w:lvl>
+    <w:lvl w:ilvl="6">
+      <w:start w:val="1"/>
+      <w:numFmt w:val="decimal"/>
+      <w:lvlText w:val="%7."/>
+      <w:lvlJc w:val="left"/>
+      <w:pPr>
+        <w:ind w:left="2976" w:hanging="336"/>
+      </w:pPr>
+    </w:lvl>
+    <w:lvl w:ilvl="0">
+      <w:start w:val="1"/>
+      <w:numFmt w:val="decimal"/>
+      <w:lvlText w:val="%1."/>
+      <w:lvlJc w:val="left"/>
+      <w:pPr>
+        <w:ind w:left="336" w:hanging="336"/>
+      </w:pPr>
+      <w:rPr>
+        <w:rFonts w:hint="default" w:ascii="" w:hAnsi="" w:cs=""/>
+      </w:rPr>
+    </w:lvl>
+    <w:lvl w:ilvl="8">
+      <w:start w:val="1"/>
+      <w:numFmt w:val="lowerRoman"/>
+      <w:lvlText w:val="%9."/>
+      <w:lvlJc w:val="left"/>
+      <w:pPr>
+        <w:ind w:left="3856" w:hanging="336"/>
+      </w:pPr>
+    </w:lvl>
+    <w:lvl w:ilvl="5">
+      <w:start w:val="1"/>
+      <w:numFmt w:val="lowerRoman"/>
+      <w:lvlText w:val="%6."/>
+      <w:lvlJc w:val="left"/>
+      <w:pPr>
+        <w:ind w:left="2536" w:hanging="336"/>
+      </w:pPr>
+    </w:lvl>
+    <w:lvl w:ilvl="2">
+      <w:start w:val="1"/>
+      <w:numFmt w:val="lowerRoman"/>
+      <w:lvlText w:val="%3."/>
+      <w:lvlJc w:val="left"/>
+      <w:pPr>
+        <w:ind w:left="1216" w:hanging="336"/>
+      </w:pPr>
+    </w:lvl>
+    <w:lvl w:ilvl="7">
+      <w:start w:val="1"/>
+      <w:numFmt w:val="lowerLetter"/>
+      <w:lvlText w:val="%8."/>
+      <w:lvlJc w:val="left"/>
+      <w:pPr>
+        <w:ind w:left="3416" w:hanging="336"/>
+      </w:pPr>
+    </w:lvl>
+    <w:lvl w:ilvl="4">
+      <w:start w:val="1"/>
+      <w:numFmt w:val="lowerLetter"/>
+      <w:lvlText w:val="%5."/>
+      <w:lvlJc w:val="left"/>
+      <w:pPr>
+        <w:ind w:left="2096" w:hanging="336"/>
+      </w:pPr>
+    </w:lvl>
+    <w:lvl w:ilvl="1">
+      <w:start w:val="1"/>
+      <w:numFmt w:val="lowerLetter"/>
+      <w:lvlText w:val="%2."/>
+      <w:lvlJc w:val="left"/>
+      <w:pPr>
+        <w:ind w:left="776" w:hanging="336"/>
+      </w:pPr>
+    </w:lvl>
+  </w:abstractNum>
+  <w:abstractNum w:abstractNumId="2">
     <w:lvl w:ilvl="0">
       <w:start w:val="1"/>
       <w:numFmt w:val="bullet"/>
@@ -2916,12 +3002,34 @@
         <w:rFonts w:hint="default" w:ascii="wingdings" w:hAnsi="wingdings" w:cs="wingdings"/>
       </w:rPr>
     </w:lvl>
-    <w:lvl w:ilvl="2">
+    <w:lvl w:ilvl="1">
+      <w:start w:val="1"/>
+      <w:numFmt w:val="bullet"/>
+      <w:lvlText w:val="¡"/>
+      <w:pPr>
+        <w:ind w:leftChars="200" w:hanging="336"/>
+      </w:pPr>
+      <w:rPr>
+        <w:rFonts w:hint="default" w:ascii="wingdings" w:hAnsi="wingdings" w:cs="wingdings"/>
+      </w:rPr>
+    </w:lvl>
+    <w:lvl w:ilvl="5">
       <w:start w:val="1"/>
       <w:numFmt w:val="bullet"/>
       <w:lvlText w:val=""/>
       <w:pPr>
-        <w:ind w:leftChars="400" w:hanging="336"/>
+        <w:ind w:leftChars="1000" w:hanging="336"/>
+      </w:pPr>
+      <w:rPr>
+        <w:rFonts w:hint="default" w:ascii="wingdings" w:hAnsi="wingdings" w:cs="wingdings"/>
+      </w:rPr>
+    </w:lvl>
+    <w:lvl w:ilvl="3">
+      <w:start w:val="1"/>
+      <w:numFmt w:val="bullet"/>
+      <w:lvlText w:val=""/>
+      <w:pPr>
+        <w:ind w:leftChars="600" w:hanging="0"/>
       </w:pPr>
       <w:rPr>
         <w:rFonts w:hint="default" w:ascii="wingdings" w:hAnsi="wingdings" w:cs="wingdings"/>
@@ -2938,23 +3046,12 @@
         <w:rFonts w:hint="default" w:ascii="wingdings" w:hAnsi="wingdings" w:cs="wingdings"/>
       </w:rPr>
     </w:lvl>
-    <w:lvl w:ilvl="5">
+    <w:lvl w:ilvl="8">
       <w:start w:val="1"/>
       <w:numFmt w:val="bullet"/>
       <w:lvlText w:val=""/>
       <w:pPr>
-        <w:ind w:leftChars="1000" w:hanging="336"/>
-      </w:pPr>
-      <w:rPr>
-        <w:rFonts w:hint="default" w:ascii="wingdings" w:hAnsi="wingdings" w:cs="wingdings"/>
-      </w:rPr>
-    </w:lvl>
-    <w:lvl w:ilvl="3">
-      <w:start w:val="1"/>
-      <w:numFmt w:val="bullet"/>
-      <w:lvlText w:val=""/>
-      <w:pPr>
-        <w:ind w:leftChars="600" w:hanging="0"/>
+        <w:ind w:leftChars="1600" w:hanging="336"/>
       </w:pPr>
       <w:rPr>
         <w:rFonts w:hint="default" w:ascii="wingdings" w:hAnsi="wingdings" w:cs="wingdings"/>
@@ -2971,120 +3068,23 @@
         <w:rFonts w:hint="default" w:ascii="wingdings" w:hAnsi="wingdings" w:cs="wingdings"/>
       </w:rPr>
     </w:lvl>
-    <w:lvl w:ilvl="8">
+    <w:lvl w:ilvl="2">
       <w:start w:val="1"/>
       <w:numFmt w:val="bullet"/>
       <w:lvlText w:val=""/>
       <w:pPr>
-        <w:ind w:leftChars="1600" w:hanging="336"/>
-      </w:pPr>
-      <w:rPr>
-        <w:rFonts w:hint="default" w:ascii="wingdings" w:hAnsi="wingdings" w:cs="wingdings"/>
-      </w:rPr>
-    </w:lvl>
-    <w:lvl w:ilvl="1">
-      <w:start w:val="1"/>
-      <w:numFmt w:val="bullet"/>
-      <w:lvlText w:val="¡"/>
-      <w:pPr>
-        <w:ind w:leftChars="200" w:hanging="336"/>
+        <w:ind w:leftChars="400" w:hanging="336"/>
       </w:pPr>
       <w:rPr>
         <w:rFonts w:hint="default" w:ascii="wingdings" w:hAnsi="wingdings" w:cs="wingdings"/>
       </w:rPr>
     </w:lvl>
   </w:abstractNum>
-  <w:abstractNum w:abstractNumId="2">
-    <w:lvl w:ilvl="4">
-      <w:start w:val="1"/>
-      <w:numFmt w:val="lowerLetter"/>
-      <w:lvlText w:val="%5."/>
-      <w:lvlJc w:val="left"/>
-      <w:pPr>
-        <w:ind w:left="2096" w:hanging="336"/>
-      </w:pPr>
-    </w:lvl>
-    <w:lvl w:ilvl="0">
-      <w:start w:val="1"/>
-      <w:numFmt w:val="decimal"/>
-      <w:lvlText w:val="%1."/>
-      <w:lvlJc w:val="left"/>
-      <w:pPr>
-        <w:ind w:left="336" w:hanging="336"/>
-      </w:pPr>
-      <w:rPr>
-        <w:rFonts w:hint="default" w:ascii="" w:hAnsi="" w:cs=""/>
-      </w:rPr>
-    </w:lvl>
-    <w:lvl w:ilvl="6">
-      <w:start w:val="1"/>
-      <w:numFmt w:val="decimal"/>
-      <w:lvlText w:val="%7."/>
-      <w:lvlJc w:val="left"/>
-      <w:pPr>
-        <w:ind w:left="2976" w:hanging="336"/>
-      </w:pPr>
-    </w:lvl>
-    <w:lvl w:ilvl="7">
-      <w:start w:val="1"/>
-      <w:numFmt w:val="lowerLetter"/>
-      <w:lvlText w:val="%8."/>
-      <w:lvlJc w:val="left"/>
-      <w:pPr>
-        <w:ind w:left="3416" w:hanging="336"/>
-      </w:pPr>
-    </w:lvl>
-    <w:lvl w:ilvl="2">
-      <w:start w:val="1"/>
-      <w:numFmt w:val="lowerRoman"/>
-      <w:lvlText w:val="%3."/>
-      <w:lvlJc w:val="left"/>
-      <w:pPr>
-        <w:ind w:left="1216" w:hanging="336"/>
-      </w:pPr>
-    </w:lvl>
-    <w:lvl w:ilvl="5">
-      <w:start w:val="1"/>
-      <w:numFmt w:val="lowerRoman"/>
-      <w:lvlText w:val="%6."/>
-      <w:lvlJc w:val="left"/>
-      <w:pPr>
-        <w:ind w:left="2536" w:hanging="336"/>
-      </w:pPr>
-    </w:lvl>
-    <w:lvl w:ilvl="8">
-      <w:start w:val="1"/>
-      <w:numFmt w:val="lowerRoman"/>
-      <w:lvlText w:val="%9."/>
-      <w:lvlJc w:val="left"/>
-      <w:pPr>
-        <w:ind w:left="3856" w:hanging="336"/>
-      </w:pPr>
-    </w:lvl>
-    <w:lvl w:ilvl="3">
-      <w:start w:val="1"/>
-      <w:numFmt w:val="decimal"/>
-      <w:lvlText w:val="%4."/>
-      <w:lvlJc w:val="left"/>
-      <w:pPr>
-        <w:ind w:left="1656" w:hanging="336"/>
-      </w:pPr>
-    </w:lvl>
-    <w:lvl w:ilvl="1">
-      <w:start w:val="1"/>
-      <w:numFmt w:val="lowerLetter"/>
-      <w:lvlText w:val="%2."/>
-      <w:lvlJc w:val="left"/>
-      <w:pPr>
-        <w:ind w:left="776" w:hanging="336"/>
-      </w:pPr>
-    </w:lvl>
-  </w:abstractNum>
   <w:num w:numId="1">
-    <w:abstractNumId w:val="2"/>
+    <w:abstractNumId w:val="1"/>
   </w:num>
   <w:num w:numId="2">
-    <w:abstractNumId w:val="1"/>
+    <w:abstractNumId w:val="2"/>
   </w:num>
 </w:numbering>
 </file>
@@ -3108,24 +3108,7 @@
       </w:pPr>
     </w:pPrDefault>
   </w:docDefaults>
-  <w:style w:type="table" w:styleId="3chtoc" w:default="true">
-    <w:name w:val="Normal Table"/>
-    <w:basedOn w:val=""/>
-    <w:next w:val=""/>
-    <w:uiPriority w:val="99"/>
-    <w:semiHidden/>
-    <w:unhideWhenUsed/>
-    <w:tblPr>
-      <w:tblInd w:w="0" w:type="dxa"/>
-      <w:tblCellMar>
-        <w:top w:w="0" w:type="dxa"/>
-        <w:left w:w="108" w:type="dxa"/>
-        <w:bottom w:w="0" w:type="dxa"/>
-        <w:right w:w="108" w:type="dxa"/>
-      </w:tblCellMar>
-    </w:tblPr>
-  </w:style>
-  <w:style w:type="paragraph" w:styleId="mqtx0l">
+  <w:style w:type="paragraph" w:styleId="3r8win">
     <w:name w:val="heading 1"/>
     <w:basedOn w:val="ablt93"/>
     <w:next w:val="ablt93"/>
@@ -3143,6 +3126,26 @@
       <w:color w:val="1A1A1A"/>
       <w:sz w:val="36"/>
       <w:szCs w:val="36"/>
+    </w:rPr>
+  </w:style>
+  <w:style w:type="paragraph" w:styleId="125olo">
+    <w:name w:val="heading 2"/>
+    <w:basedOn w:val="ablt93"/>
+    <w:next w:val="ablt93"/>
+    <w:uiPriority w:val="9"/>
+    <w:qFormat/>
+    <w:pPr>
+      <w:keepNext/>
+      <w:keepLines/>
+      <w:spacing w:before="0" w:after="0" w:line="408" w:lineRule="auto"/>
+      <w:outlineLvl w:val="1"/>
+    </w:pPr>
+    <w:rPr>
+      <w:b/>
+      <w:bCs/>
+      <w:color w:val="1A1A1A"/>
+      <w:sz w:val="32"/>
+      <w:szCs w:val="32"/>
     </w:rPr>
   </w:style>
   <w:style w:type="table" w:styleId="88zzt6">
@@ -3164,7 +3167,26 @@
       <w:vAlign w:val="center"/>
     </w:tcPr>
   </w:style>
-  <w:style w:type="paragraph" w:styleId="125olo">
+  <w:style w:type="table" w:styleId="nn7qvs">
+    <w:name w:val="Table Grid"/>
+    <w:basedOn w:val="gllumf"/>
+    <w:next w:val=""/>
+    <w:uiPriority w:val="39"/>
+    <w:tblPr>
+      <w:tblBorders>
+        <w:top w:val="single" w:color="CBCDD1" w:sz="6" w:space="0"/>
+        <w:left w:val="single" w:color="CBCDD1" w:sz="6" w:space="0"/>
+        <w:bottom w:val="single" w:color="CBCDD1" w:sz="6" w:space="0"/>
+        <w:right w:val="single" w:color="CBCDD1" w:sz="6" w:space="0"/>
+        <w:insideH w:val="single" w:color="CBCDD1" w:sz="6" w:space="0"/>
+        <w:insideV w:val="single" w:color="CBCDD1" w:sz="6" w:space="0"/>
+      </w:tblBorders>
+    </w:tblPr>
+    <w:tcPr>
+      <w:vAlign w:val="center"/>
+    </w:tcPr>
+  </w:style>
+  <w:style w:type="paragraph" w:styleId="pqwr7t">
     <w:name w:val="heading 2"/>
     <w:basedOn w:val="ablt93"/>
     <w:next w:val="ablt93"/>
@@ -3184,7 +3206,27 @@
       <w:szCs w:val="32"/>
     </w:rPr>
   </w:style>
-  <w:style w:type="paragraph" w:styleId="dvbscu">
+  <w:style w:type="paragraph" w:styleId="ig2h0d">
+    <w:name w:val="heading 1"/>
+    <w:basedOn w:val="ablt93"/>
+    <w:next w:val="ablt93"/>
+    <w:uiPriority w:val="9"/>
+    <w:qFormat/>
+    <w:pPr>
+      <w:keepNext/>
+      <w:keepLines/>
+      <w:spacing w:before="0" w:after="0" w:line="408" w:lineRule="auto"/>
+      <w:outlineLvl w:val="0"/>
+    </w:pPr>
+    <w:rPr>
+      <w:b/>
+      <w:bCs/>
+      <w:color w:val="1A1A1A"/>
+      <w:sz w:val="36"/>
+      <w:szCs w:val="36"/>
+    </w:rPr>
+  </w:style>
+  <w:style w:type="paragraph" w:styleId="107i05">
     <w:name w:val="heading 2"/>
     <w:basedOn w:val="ablt93"/>
     <w:next w:val="ablt93"/>
@@ -3204,17 +3246,104 @@
       <w:szCs w:val="32"/>
     </w:rPr>
   </w:style>
-  <w:style w:type="character" w:styleId="two4gh">
-    <w:name w:val="melo-codeblock-Base-theme-char"/>
+  <w:style w:type="paragraph" w:styleId="dhedoi">
+    <w:name w:val="heading 3"/>
+    <w:basedOn w:val="ablt93"/>
+    <w:next w:val="ablt93"/>
+    <w:uiPriority w:val="9"/>
+    <w:qFormat/>
+    <w:pPr>
+      <w:keepNext/>
+      <w:keepLines/>
+      <w:spacing w:before="0" w:after="0" w:line="408" w:lineRule="auto"/>
+      <w:outlineLvl w:val="2"/>
+    </w:pPr>
+    <w:rPr>
+      <w:b/>
+      <w:bCs/>
+      <w:color w:val="1A1A1A"/>
+      <w:sz w:val="28"/>
+      <w:szCs w:val="28"/>
+    </w:rPr>
+  </w:style>
+  <w:style w:type="paragraph" w:styleId="anefa8">
+    <w:name w:val="heading 1"/>
+    <w:basedOn w:val="ablt93"/>
+    <w:next w:val="ablt93"/>
+    <w:uiPriority w:val="9"/>
+    <w:qFormat/>
+    <w:pPr>
+      <w:keepNext/>
+      <w:keepLines/>
+      <w:spacing w:before="0" w:after="0" w:line="408" w:lineRule="auto"/>
+      <w:outlineLvl w:val="0"/>
+    </w:pPr>
+    <w:rPr>
+      <w:b/>
+      <w:bCs/>
+      <w:color w:val="1A1A1A"/>
+      <w:sz w:val="36"/>
+      <w:szCs w:val="36"/>
+    </w:rPr>
+  </w:style>
+  <w:style w:type="table" w:styleId="z5a0lc" w:default="true">
+    <w:name w:val="Normal Table"/>
     <w:basedOn w:val=""/>
     <w:next w:val=""/>
-    <w:rPr>
-      <w:rFonts w:ascii="Monaco" w:hAnsi="Monaco" w:eastAsia="Monaco" w:cs="Monaco"/>
-      <w:color w:val="000000"/>
-      <w:sz w:val="21"/>
-    </w:rPr>
-  </w:style>
-  <w:style w:type="paragraph" w:styleId="q9jtn4">
+    <w:uiPriority w:val="99"/>
+    <w:semiHidden/>
+    <w:unhideWhenUsed/>
+    <w:tblPr>
+      <w:tblInd w:w="0" w:type="dxa"/>
+      <w:tblCellMar>
+        <w:top w:w="0" w:type="dxa"/>
+        <w:left w:w="108" w:type="dxa"/>
+        <w:bottom w:w="0" w:type="dxa"/>
+        <w:right w:w="108" w:type="dxa"/>
+      </w:tblCellMar>
+    </w:tblPr>
+  </w:style>
+  <w:style w:type="paragraph" w:styleId="om8cq1">
+    <w:name w:val="heading 1"/>
+    <w:basedOn w:val="ablt93"/>
+    <w:next w:val="ablt93"/>
+    <w:uiPriority w:val="9"/>
+    <w:qFormat/>
+    <w:pPr>
+      <w:keepNext/>
+      <w:keepLines/>
+      <w:spacing w:before="0" w:after="0" w:line="408" w:lineRule="auto"/>
+      <w:outlineLvl w:val="0"/>
+    </w:pPr>
+    <w:rPr>
+      <w:b/>
+      <w:bCs/>
+      <w:color w:val="1A1A1A"/>
+      <w:sz w:val="36"/>
+      <w:szCs w:val="36"/>
+    </w:rPr>
+  </w:style>
+  <w:style w:type="paragraph" w:styleId="mqtx0l">
+    <w:name w:val="heading 1"/>
+    <w:basedOn w:val="ablt93"/>
+    <w:next w:val="ablt93"/>
+    <w:uiPriority w:val="9"/>
+    <w:qFormat/>
+    <w:pPr>
+      <w:keepNext/>
+      <w:keepLines/>
+      <w:spacing w:before="0" w:after="0" w:line="408" w:lineRule="auto"/>
+      <w:outlineLvl w:val="0"/>
+    </w:pPr>
+    <w:rPr>
+      <w:b/>
+      <w:bCs/>
+      <w:color w:val="1A1A1A"/>
+      <w:sz w:val="36"/>
+      <w:szCs w:val="36"/>
+    </w:rPr>
+  </w:style>
+  <w:style w:type="paragraph" w:styleId="wxn7la">
     <w:name w:val="heading 2"/>
     <w:basedOn w:val="ablt93"/>
     <w:next w:val="ablt93"/>
@@ -3234,8 +3363,18 @@
       <w:szCs w:val="32"/>
     </w:rPr>
   </w:style>
-  <w:style w:type="paragraph" w:styleId="ou0r7i">
-    <w:name w:val="heading 1"/>
+  <w:style w:type="character" w:styleId="two4gh">
+    <w:name w:val="melo-codeblock-Base-theme-char"/>
+    <w:basedOn w:val=""/>
+    <w:next w:val=""/>
+    <w:rPr>
+      <w:rFonts w:ascii="Monaco" w:hAnsi="Monaco" w:eastAsia="Monaco" w:cs="Monaco"/>
+      <w:color w:val="000000"/>
+      <w:sz w:val="21"/>
+    </w:rPr>
+  </w:style>
+  <w:style w:type="paragraph" w:styleId="fqhxuo">
+    <w:name w:val="heading 3"/>
     <w:basedOn w:val="ablt93"/>
     <w:next w:val="ablt93"/>
     <w:uiPriority w:val="9"/>
@@ -3244,37 +3383,36 @@
       <w:keepNext/>
       <w:keepLines/>
       <w:spacing w:before="0" w:after="0" w:line="408" w:lineRule="auto"/>
-      <w:outlineLvl w:val="0"/>
+      <w:outlineLvl w:val="2"/>
     </w:pPr>
     <w:rPr>
       <w:b/>
       <w:bCs/>
       <w:color w:val="1A1A1A"/>
-      <w:sz w:val="36"/>
-      <w:szCs w:val="36"/>
-    </w:rPr>
-  </w:style>
-  <w:style w:type="paragraph" w:styleId="lptxjf">
-    <w:name w:val="heading 1"/>
-    <w:basedOn w:val="ablt93"/>
-    <w:next w:val="ablt93"/>
-    <w:uiPriority w:val="9"/>
-    <w:qFormat/>
-    <w:pPr>
-      <w:keepNext/>
-      <w:keepLines/>
-      <w:spacing w:before="0" w:after="0" w:line="408" w:lineRule="auto"/>
-      <w:outlineLvl w:val="0"/>
-    </w:pPr>
-    <w:rPr>
-      <w:b/>
-      <w:bCs/>
-      <w:color w:val="1A1A1A"/>
-      <w:sz w:val="36"/>
-      <w:szCs w:val="36"/>
-    </w:rPr>
-  </w:style>
-  <w:style w:type="paragraph" w:styleId="ixz60w">
+      <w:sz w:val="28"/>
+      <w:szCs w:val="28"/>
+    </w:rPr>
+  </w:style>
+  <w:style w:type="table" w:styleId="ve86m4">
+    <w:name w:val="Table Grid"/>
+    <w:basedOn w:val="z5a0lc"/>
+    <w:next w:val=""/>
+    <w:uiPriority w:val="39"/>
+    <w:tblPr>
+      <w:tblBorders>
+        <w:top w:val="single" w:color="CBCDD1" w:sz="6" w:space="0"/>
+        <w:left w:val="single" w:color="CBCDD1" w:sz="6" w:space="0"/>
+        <w:bottom w:val="single" w:color="CBCDD1" w:sz="6" w:space="0"/>
+        <w:right w:val="single" w:color="CBCDD1" w:sz="6" w:space="0"/>
+        <w:insideH w:val="single" w:color="CBCDD1" w:sz="6" w:space="0"/>
+        <w:insideV w:val="single" w:color="CBCDD1" w:sz="6" w:space="0"/>
+      </w:tblBorders>
+    </w:tblPr>
+    <w:tcPr>
+      <w:vAlign w:val="center"/>
+    </w:tcPr>
+  </w:style>
+  <w:style w:type="paragraph" w:styleId="vx48nr">
     <w:name w:val="heading 2"/>
     <w:basedOn w:val="ablt93"/>
     <w:next w:val="ablt93"/>
@@ -3292,6 +3430,66 @@
       <w:color w:val="1A1A1A"/>
       <w:sz w:val="32"/>
       <w:szCs w:val="32"/>
+    </w:rPr>
+  </w:style>
+  <w:style w:type="paragraph" w:styleId="yzns4d">
+    <w:name w:val="heading 3"/>
+    <w:basedOn w:val="ablt93"/>
+    <w:next w:val="ablt93"/>
+    <w:uiPriority w:val="9"/>
+    <w:qFormat/>
+    <w:pPr>
+      <w:keepNext/>
+      <w:keepLines/>
+      <w:spacing w:before="0" w:after="0" w:line="408" w:lineRule="auto"/>
+      <w:outlineLvl w:val="2"/>
+    </w:pPr>
+    <w:rPr>
+      <w:b/>
+      <w:bCs/>
+      <w:color w:val="1A1A1A"/>
+      <w:sz w:val="28"/>
+      <w:szCs w:val="28"/>
+    </w:rPr>
+  </w:style>
+  <w:style w:type="paragraph" w:styleId="blefud">
+    <w:name w:val="heading 3"/>
+    <w:basedOn w:val="ablt93"/>
+    <w:next w:val="ablt93"/>
+    <w:uiPriority w:val="9"/>
+    <w:qFormat/>
+    <w:pPr>
+      <w:keepNext/>
+      <w:keepLines/>
+      <w:spacing w:before="0" w:after="0" w:line="408" w:lineRule="auto"/>
+      <w:outlineLvl w:val="2"/>
+    </w:pPr>
+    <w:rPr>
+      <w:b/>
+      <w:bCs/>
+      <w:color w:val="1A1A1A"/>
+      <w:sz w:val="28"/>
+      <w:szCs w:val="28"/>
+    </w:rPr>
+  </w:style>
+  <w:style w:type="paragraph" w:styleId="wkchfm">
+    <w:name w:val="heading 3"/>
+    <w:basedOn w:val="ablt93"/>
+    <w:next w:val="ablt93"/>
+    <w:uiPriority w:val="9"/>
+    <w:qFormat/>
+    <w:pPr>
+      <w:keepNext/>
+      <w:keepLines/>
+      <w:spacing w:before="0" w:after="0" w:line="408" w:lineRule="auto"/>
+      <w:outlineLvl w:val="2"/>
+    </w:pPr>
+    <w:rPr>
+      <w:b/>
+      <w:bCs/>
+      <w:color w:val="1A1A1A"/>
+      <w:sz w:val="28"/>
+      <w:szCs w:val="28"/>
     </w:rPr>
   </w:style>
   <w:style w:type="table" w:styleId="ny0jmv" w:default="true">
@@ -3311,20 +3509,7 @@
       </w:tblCellMar>
     </w:tblPr>
   </w:style>
-  <w:style w:type="paragraph" w:styleId="8s6z39">
-    <w:name w:val="melo-codeblock-Base-theme-para"/>
-    <w:basedOn w:val="ablt93"/>
-    <w:next w:val=""/>
-    <w:pPr>
-      <w:spacing w:before="0" w:after="0" w:line="360" w:lineRule="auto"/>
-    </w:pPr>
-    <w:rPr>
-      <w:rFonts w:ascii="Monaco" w:hAnsi="Monaco" w:eastAsia="Monaco" w:cs="Monaco"/>
-      <w:color w:val="000000"/>
-      <w:sz w:val="21"/>
-    </w:rPr>
-  </w:style>
-  <w:style w:type="paragraph" w:styleId="5b8dig">
+  <w:style w:type="paragraph" w:styleId="dvbscu">
     <w:name w:val="heading 2"/>
     <w:basedOn w:val="ablt93"/>
     <w:next w:val="ablt93"/>
@@ -3342,6 +3527,292 @@
       <w:color w:val="1A1A1A"/>
       <w:sz w:val="32"/>
       <w:szCs w:val="32"/>
+    </w:rPr>
+  </w:style>
+  <w:style w:type="table" w:styleId="3chtoc" w:default="true">
+    <w:name w:val="Normal Table"/>
+    <w:basedOn w:val=""/>
+    <w:next w:val=""/>
+    <w:uiPriority w:val="99"/>
+    <w:semiHidden/>
+    <w:unhideWhenUsed/>
+    <w:tblPr>
+      <w:tblInd w:w="0" w:type="dxa"/>
+      <w:tblCellMar>
+        <w:top w:w="0" w:type="dxa"/>
+        <w:left w:w="108" w:type="dxa"/>
+        <w:bottom w:w="0" w:type="dxa"/>
+        <w:right w:w="108" w:type="dxa"/>
+      </w:tblCellMar>
+    </w:tblPr>
+  </w:style>
+  <w:style w:type="paragraph" w:styleId="cnhf1q">
+    <w:name w:val="heading 2"/>
+    <w:basedOn w:val="ablt93"/>
+    <w:next w:val="ablt93"/>
+    <w:uiPriority w:val="9"/>
+    <w:qFormat/>
+    <w:pPr>
+      <w:keepNext/>
+      <w:keepLines/>
+      <w:spacing w:before="0" w:after="0" w:line="408" w:lineRule="auto"/>
+      <w:outlineLvl w:val="1"/>
+    </w:pPr>
+    <w:rPr>
+      <w:b/>
+      <w:bCs/>
+      <w:color w:val="1A1A1A"/>
+      <w:sz w:val="32"/>
+      <w:szCs w:val="32"/>
+    </w:rPr>
+  </w:style>
+  <w:style w:type="paragraph" w:styleId="ixz60w">
+    <w:name w:val="heading 2"/>
+    <w:basedOn w:val="ablt93"/>
+    <w:next w:val="ablt93"/>
+    <w:uiPriority w:val="9"/>
+    <w:qFormat/>
+    <w:pPr>
+      <w:keepNext/>
+      <w:keepLines/>
+      <w:spacing w:before="0" w:after="0" w:line="408" w:lineRule="auto"/>
+      <w:outlineLvl w:val="1"/>
+    </w:pPr>
+    <w:rPr>
+      <w:b/>
+      <w:bCs/>
+      <w:color w:val="1A1A1A"/>
+      <w:sz w:val="32"/>
+      <w:szCs w:val="32"/>
+    </w:rPr>
+  </w:style>
+  <w:style w:type="table" w:styleId="5owzcn">
+    <w:name w:val="Table Grid"/>
+    <w:basedOn w:val="3chtoc"/>
+    <w:next w:val=""/>
+    <w:uiPriority w:val="39"/>
+    <w:tblPr>
+      <w:tblBorders>
+        <w:top w:val="single" w:color="CBCDD1" w:sz="6" w:space="0"/>
+        <w:left w:val="single" w:color="CBCDD1" w:sz="6" w:space="0"/>
+        <w:bottom w:val="single" w:color="CBCDD1" w:sz="6" w:space="0"/>
+        <w:right w:val="single" w:color="CBCDD1" w:sz="6" w:space="0"/>
+        <w:insideH w:val="single" w:color="CBCDD1" w:sz="6" w:space="0"/>
+        <w:insideV w:val="single" w:color="CBCDD1" w:sz="6" w:space="0"/>
+      </w:tblBorders>
+    </w:tblPr>
+    <w:tcPr>
+      <w:vAlign w:val="center"/>
+    </w:tcPr>
+  </w:style>
+  <w:style w:type="paragraph" w:styleId="q4634k">
+    <w:name w:val="heading 2"/>
+    <w:basedOn w:val="ablt93"/>
+    <w:next w:val="ablt93"/>
+    <w:uiPriority w:val="9"/>
+    <w:qFormat/>
+    <w:pPr>
+      <w:keepNext/>
+      <w:keepLines/>
+      <w:spacing w:before="0" w:after="0" w:line="408" w:lineRule="auto"/>
+      <w:outlineLvl w:val="1"/>
+    </w:pPr>
+    <w:rPr>
+      <w:b/>
+      <w:bCs/>
+      <w:color w:val="1A1A1A"/>
+      <w:sz w:val="32"/>
+      <w:szCs w:val="32"/>
+    </w:rPr>
+  </w:style>
+  <w:style w:type="paragraph" w:styleId="q9jtn4">
+    <w:name w:val="heading 2"/>
+    <w:basedOn w:val="ablt93"/>
+    <w:next w:val="ablt93"/>
+    <w:uiPriority w:val="9"/>
+    <w:qFormat/>
+    <w:pPr>
+      <w:keepNext/>
+      <w:keepLines/>
+      <w:spacing w:before="0" w:after="0" w:line="408" w:lineRule="auto"/>
+      <w:outlineLvl w:val="1"/>
+    </w:pPr>
+    <w:rPr>
+      <w:b/>
+      <w:bCs/>
+      <w:color w:val="1A1A1A"/>
+      <w:sz w:val="32"/>
+      <w:szCs w:val="32"/>
+    </w:rPr>
+  </w:style>
+  <w:style w:type="paragraph" w:styleId="d6s8m3">
+    <w:name w:val="heading 3"/>
+    <w:basedOn w:val="ablt93"/>
+    <w:next w:val="ablt93"/>
+    <w:uiPriority w:val="9"/>
+    <w:qFormat/>
+    <w:pPr>
+      <w:keepNext/>
+      <w:keepLines/>
+      <w:spacing w:before="0" w:after="0" w:line="408" w:lineRule="auto"/>
+      <w:outlineLvl w:val="2"/>
+    </w:pPr>
+    <w:rPr>
+      <w:b/>
+      <w:bCs/>
+      <w:color w:val="1A1A1A"/>
+      <w:sz w:val="28"/>
+      <w:szCs w:val="28"/>
+    </w:rPr>
+  </w:style>
+  <w:style w:type="paragraph" w:styleId="1hlbz2">
+    <w:name w:val="heading 3"/>
+    <w:basedOn w:val="ablt93"/>
+    <w:next w:val="ablt93"/>
+    <w:uiPriority w:val="9"/>
+    <w:qFormat/>
+    <w:pPr>
+      <w:keepNext/>
+      <w:keepLines/>
+      <w:spacing w:before="0" w:after="0" w:line="408" w:lineRule="auto"/>
+      <w:outlineLvl w:val="2"/>
+    </w:pPr>
+    <w:rPr>
+      <w:b/>
+      <w:bCs/>
+      <w:color w:val="1A1A1A"/>
+      <w:sz w:val="28"/>
+      <w:szCs w:val="28"/>
+    </w:rPr>
+  </w:style>
+  <w:style w:type="paragraph" w:styleId="fst5p9">
+    <w:name w:val="heading 1"/>
+    <w:basedOn w:val="ablt93"/>
+    <w:next w:val="ablt93"/>
+    <w:uiPriority w:val="9"/>
+    <w:qFormat/>
+    <w:pPr>
+      <w:keepNext/>
+      <w:keepLines/>
+      <w:spacing w:before="0" w:after="0" w:line="408" w:lineRule="auto"/>
+      <w:outlineLvl w:val="0"/>
+    </w:pPr>
+    <w:rPr>
+      <w:b/>
+      <w:bCs/>
+      <w:color w:val="1A1A1A"/>
+      <w:sz w:val="36"/>
+      <w:szCs w:val="36"/>
+    </w:rPr>
+  </w:style>
+  <w:style w:type="paragraph" w:styleId="09unrc">
+    <w:name w:val="heading 1"/>
+    <w:basedOn w:val="ablt93"/>
+    <w:next w:val="ablt93"/>
+    <w:uiPriority w:val="9"/>
+    <w:qFormat/>
+    <w:pPr>
+      <w:keepNext/>
+      <w:keepLines/>
+      <w:spacing w:before="0" w:after="0" w:line="408" w:lineRule="auto"/>
+      <w:outlineLvl w:val="0"/>
+    </w:pPr>
+    <w:rPr>
+      <w:b/>
+      <w:bCs/>
+      <w:color w:val="1A1A1A"/>
+      <w:sz w:val="36"/>
+      <w:szCs w:val="36"/>
+    </w:rPr>
+  </w:style>
+  <w:style w:type="paragraph" w:styleId="8s6z39">
+    <w:name w:val="melo-codeblock-Base-theme-para"/>
+    <w:basedOn w:val="ablt93"/>
+    <w:next w:val=""/>
+    <w:pPr>
+      <w:spacing w:before="0" w:after="0" w:line="360" w:lineRule="auto"/>
+    </w:pPr>
+    <w:rPr>
+      <w:rFonts w:ascii="Monaco" w:hAnsi="Monaco" w:eastAsia="Monaco" w:cs="Monaco"/>
+      <w:color w:val="000000"/>
+      <w:sz w:val="21"/>
+    </w:rPr>
+  </w:style>
+  <w:style w:type="paragraph" w:styleId="0yo7r5">
+    <w:name w:val="heading 2"/>
+    <w:basedOn w:val="ablt93"/>
+    <w:next w:val="ablt93"/>
+    <w:uiPriority w:val="9"/>
+    <w:qFormat/>
+    <w:pPr>
+      <w:keepNext/>
+      <w:keepLines/>
+      <w:spacing w:before="0" w:after="0" w:line="408" w:lineRule="auto"/>
+      <w:outlineLvl w:val="1"/>
+    </w:pPr>
+    <w:rPr>
+      <w:b/>
+      <w:bCs/>
+      <w:color w:val="1A1A1A"/>
+      <w:sz w:val="32"/>
+      <w:szCs w:val="32"/>
+    </w:rPr>
+  </w:style>
+  <w:style w:type="table" w:styleId="gllumf" w:default="true">
+    <w:name w:val="Normal Table"/>
+    <w:basedOn w:val=""/>
+    <w:next w:val=""/>
+    <w:uiPriority w:val="99"/>
+    <w:semiHidden/>
+    <w:unhideWhenUsed/>
+    <w:tblPr>
+      <w:tblInd w:w="0" w:type="dxa"/>
+      <w:tblCellMar>
+        <w:top w:w="0" w:type="dxa"/>
+        <w:left w:w="108" w:type="dxa"/>
+        <w:bottom w:w="0" w:type="dxa"/>
+        <w:right w:w="108" w:type="dxa"/>
+      </w:tblCellMar>
+    </w:tblPr>
+  </w:style>
+  <w:style w:type="paragraph" w:styleId="4x3e13">
+    <w:name w:val="heading 1"/>
+    <w:basedOn w:val="ablt93"/>
+    <w:next w:val="ablt93"/>
+    <w:uiPriority w:val="9"/>
+    <w:qFormat/>
+    <w:pPr>
+      <w:keepNext/>
+      <w:keepLines/>
+      <w:spacing w:before="0" w:after="0" w:line="408" w:lineRule="auto"/>
+      <w:outlineLvl w:val="0"/>
+    </w:pPr>
+    <w:rPr>
+      <w:b/>
+      <w:bCs/>
+      <w:color w:val="1A1A1A"/>
+      <w:sz w:val="36"/>
+      <w:szCs w:val="36"/>
+    </w:rPr>
+  </w:style>
+  <w:style w:type="paragraph" w:styleId="b52da3">
+    <w:name w:val="heading 1"/>
+    <w:basedOn w:val="ablt93"/>
+    <w:next w:val="ablt93"/>
+    <w:uiPriority w:val="9"/>
+    <w:qFormat/>
+    <w:pPr>
+      <w:keepNext/>
+      <w:keepLines/>
+      <w:spacing w:before="0" w:after="0" w:line="408" w:lineRule="auto"/>
+      <w:outlineLvl w:val="0"/>
+    </w:pPr>
+    <w:rPr>
+      <w:b/>
+      <w:bCs/>
+      <w:color w:val="1A1A1A"/>
+      <w:sz w:val="36"/>
+      <w:szCs w:val="36"/>
     </w:rPr>
   </w:style>
   <w:style w:type="table" w:styleId="ehpslr" w:default="true">
@@ -3361,7 +3832,47 @@
       </w:tblCellMar>
     </w:tblPr>
   </w:style>
-  <w:style w:type="paragraph" w:styleId="3r8win">
+  <w:style w:type="paragraph" w:styleId="ku4091">
+    <w:name w:val="heading 2"/>
+    <w:basedOn w:val="ablt93"/>
+    <w:next w:val="ablt93"/>
+    <w:uiPriority w:val="9"/>
+    <w:qFormat/>
+    <w:pPr>
+      <w:keepNext/>
+      <w:keepLines/>
+      <w:spacing w:before="0" w:after="0" w:line="408" w:lineRule="auto"/>
+      <w:outlineLvl w:val="1"/>
+    </w:pPr>
+    <w:rPr>
+      <w:b/>
+      <w:bCs/>
+      <w:color w:val="1A1A1A"/>
+      <w:sz w:val="32"/>
+      <w:szCs w:val="32"/>
+    </w:rPr>
+  </w:style>
+  <w:style w:type="paragraph" w:styleId="m1ymqs">
+    <w:name w:val="heading 3"/>
+    <w:basedOn w:val="ablt93"/>
+    <w:next w:val="ablt93"/>
+    <w:uiPriority w:val="9"/>
+    <w:qFormat/>
+    <w:pPr>
+      <w:keepNext/>
+      <w:keepLines/>
+      <w:spacing w:before="0" w:after="0" w:line="408" w:lineRule="auto"/>
+      <w:outlineLvl w:val="2"/>
+    </w:pPr>
+    <w:rPr>
+      <w:b/>
+      <w:bCs/>
+      <w:color w:val="1A1A1A"/>
+      <w:sz w:val="28"/>
+      <w:szCs w:val="28"/>
+    </w:rPr>
+  </w:style>
+  <w:style w:type="paragraph" w:styleId="isgmia">
     <w:name w:val="heading 1"/>
     <w:basedOn w:val="ablt93"/>
     <w:next w:val="ablt93"/>
@@ -3381,8 +3892,8 @@
       <w:szCs w:val="36"/>
     </w:rPr>
   </w:style>
-  <w:style w:type="paragraph" w:styleId="b52da3">
-    <w:name w:val="heading 1"/>
+  <w:style w:type="paragraph" w:styleId="5b8dig">
+    <w:name w:val="heading 2"/>
     <w:basedOn w:val="ablt93"/>
     <w:next w:val="ablt93"/>
     <w:uiPriority w:val="9"/>
@@ -3391,14 +3902,91 @@
       <w:keepNext/>
       <w:keepLines/>
       <w:spacing w:before="0" w:after="0" w:line="408" w:lineRule="auto"/>
-      <w:outlineLvl w:val="0"/>
+      <w:outlineLvl w:val="1"/>
     </w:pPr>
     <w:rPr>
       <w:b/>
       <w:bCs/>
       <w:color w:val="1A1A1A"/>
-      <w:sz w:val="36"/>
-      <w:szCs w:val="36"/>
+      <w:sz w:val="32"/>
+      <w:szCs w:val="32"/>
+    </w:rPr>
+  </w:style>
+  <w:style w:type="table" w:styleId="guzlqc" w:default="true">
+    <w:name w:val="Normal Table"/>
+    <w:basedOn w:val=""/>
+    <w:next w:val=""/>
+    <w:uiPriority w:val="99"/>
+    <w:semiHidden/>
+    <w:unhideWhenUsed/>
+    <w:tblPr>
+      <w:tblInd w:w="0" w:type="dxa"/>
+      <w:tblCellMar>
+        <w:top w:w="0" w:type="dxa"/>
+        <w:left w:w="108" w:type="dxa"/>
+        <w:bottom w:w="0" w:type="dxa"/>
+        <w:right w:w="108" w:type="dxa"/>
+      </w:tblCellMar>
+    </w:tblPr>
+  </w:style>
+  <w:style w:type="paragraph" w:styleId="fum08l">
+    <w:name w:val="heading 2"/>
+    <w:basedOn w:val="ablt93"/>
+    <w:next w:val="ablt93"/>
+    <w:uiPriority w:val="9"/>
+    <w:qFormat/>
+    <w:pPr>
+      <w:keepNext/>
+      <w:keepLines/>
+      <w:spacing w:before="0" w:after="0" w:line="408" w:lineRule="auto"/>
+      <w:outlineLvl w:val="1"/>
+    </w:pPr>
+    <w:rPr>
+      <w:b/>
+      <w:bCs/>
+      <w:color w:val="1A1A1A"/>
+      <w:sz w:val="32"/>
+      <w:szCs w:val="32"/>
+    </w:rPr>
+  </w:style>
+  <w:style w:type="paragraph" w:styleId="i0ok5w">
+    <w:name w:val="heading 2"/>
+    <w:basedOn w:val="ablt93"/>
+    <w:next w:val="ablt93"/>
+    <w:uiPriority w:val="9"/>
+    <w:qFormat/>
+    <w:pPr>
+      <w:keepNext/>
+      <w:keepLines/>
+      <w:spacing w:before="0" w:after="0" w:line="408" w:lineRule="auto"/>
+      <w:outlineLvl w:val="1"/>
+    </w:pPr>
+    <w:rPr>
+      <w:b/>
+      <w:bCs/>
+      <w:color w:val="1A1A1A"/>
+      <w:sz w:val="32"/>
+      <w:szCs w:val="32"/>
+    </w:rPr>
+  </w:style>
+  <w:style w:type="paragraph" w:styleId="vql9fw">
+    <w:name w:val="heading 2"/>
+    <w:basedOn w:val="ablt93"/>
+    <w:next w:val="ablt93"/>
+    <w:uiPriority w:val="9"/>
+    <w:qFormat/>
+    <w:pPr>
+      <w:keepNext/>
+      <w:keepLines/>
+      <w:spacing w:before="0" w:after="0" w:line="408" w:lineRule="auto"/>
+      <w:outlineLvl w:val="1"/>
+    </w:pPr>
+    <w:rPr>
+      <w:b/>
+      <w:bCs/>
+      <w:color w:val="1A1A1A"/>
+      <w:sz w:val="32"/>
+      <w:szCs w:val="32"/>
     </w:rPr>
   </w:style>
   <w:style w:type="table" w:styleId="dr1ezv">
@@ -3420,723 +4008,6 @@
       <w:vAlign w:val="center"/>
     </w:tcPr>
   </w:style>
-  <w:style w:type="table" w:styleId="z5a0lc" w:default="true">
-    <w:name w:val="Normal Table"/>
-    <w:basedOn w:val=""/>
-    <w:next w:val=""/>
-    <w:uiPriority w:val="99"/>
-    <w:semiHidden/>
-    <w:unhideWhenUsed/>
-    <w:tblPr>
-      <w:tblInd w:w="0" w:type="dxa"/>
-      <w:tblCellMar>
-        <w:top w:w="0" w:type="dxa"/>
-        <w:left w:w="108" w:type="dxa"/>
-        <w:bottom w:w="0" w:type="dxa"/>
-        <w:right w:w="108" w:type="dxa"/>
-      </w:tblCellMar>
-    </w:tblPr>
-  </w:style>
-  <w:style w:type="paragraph" w:styleId="wkchfm">
-    <w:name w:val="heading 3"/>
-    <w:basedOn w:val="ablt93"/>
-    <w:next w:val="ablt93"/>
-    <w:uiPriority w:val="9"/>
-    <w:qFormat/>
-    <w:pPr>
-      <w:keepNext/>
-      <w:keepLines/>
-      <w:spacing w:before="0" w:after="0" w:line="408" w:lineRule="auto"/>
-      <w:outlineLvl w:val="2"/>
-    </w:pPr>
-    <w:rPr>
-      <w:b/>
-      <w:bCs/>
-      <w:color w:val="1A1A1A"/>
-      <w:sz w:val="28"/>
-      <w:szCs w:val="28"/>
-    </w:rPr>
-  </w:style>
-  <w:style w:type="paragraph" w:styleId="dhedoi">
-    <w:name w:val="heading 3"/>
-    <w:basedOn w:val="ablt93"/>
-    <w:next w:val="ablt93"/>
-    <w:uiPriority w:val="9"/>
-    <w:qFormat/>
-    <w:pPr>
-      <w:keepNext/>
-      <w:keepLines/>
-      <w:spacing w:before="0" w:after="0" w:line="408" w:lineRule="auto"/>
-      <w:outlineLvl w:val="2"/>
-    </w:pPr>
-    <w:rPr>
-      <w:b/>
-      <w:bCs/>
-      <w:color w:val="1A1A1A"/>
-      <w:sz w:val="28"/>
-      <w:szCs w:val="28"/>
-    </w:rPr>
-  </w:style>
-  <w:style w:type="paragraph" w:styleId="ku4091">
-    <w:name w:val="heading 2"/>
-    <w:basedOn w:val="ablt93"/>
-    <w:next w:val="ablt93"/>
-    <w:uiPriority w:val="9"/>
-    <w:qFormat/>
-    <w:pPr>
-      <w:keepNext/>
-      <w:keepLines/>
-      <w:spacing w:before="0" w:after="0" w:line="408" w:lineRule="auto"/>
-      <w:outlineLvl w:val="1"/>
-    </w:pPr>
-    <w:rPr>
-      <w:b/>
-      <w:bCs/>
-      <w:color w:val="1A1A1A"/>
-      <w:sz w:val="32"/>
-      <w:szCs w:val="32"/>
-    </w:rPr>
-  </w:style>
-  <w:style w:type="paragraph" w:styleId="fum08l">
-    <w:name w:val="heading 2"/>
-    <w:basedOn w:val="ablt93"/>
-    <w:next w:val="ablt93"/>
-    <w:uiPriority w:val="9"/>
-    <w:qFormat/>
-    <w:pPr>
-      <w:keepNext/>
-      <w:keepLines/>
-      <w:spacing w:before="0" w:after="0" w:line="408" w:lineRule="auto"/>
-      <w:outlineLvl w:val="1"/>
-    </w:pPr>
-    <w:rPr>
-      <w:b/>
-      <w:bCs/>
-      <w:color w:val="1A1A1A"/>
-      <w:sz w:val="32"/>
-      <w:szCs w:val="32"/>
-    </w:rPr>
-  </w:style>
-  <w:style w:type="paragraph" w:styleId="blefud">
-    <w:name w:val="heading 3"/>
-    <w:basedOn w:val="ablt93"/>
-    <w:next w:val="ablt93"/>
-    <w:uiPriority w:val="9"/>
-    <w:qFormat/>
-    <w:pPr>
-      <w:keepNext/>
-      <w:keepLines/>
-      <w:spacing w:before="0" w:after="0" w:line="408" w:lineRule="auto"/>
-      <w:outlineLvl w:val="2"/>
-    </w:pPr>
-    <w:rPr>
-      <w:b/>
-      <w:bCs/>
-      <w:color w:val="1A1A1A"/>
-      <w:sz w:val="28"/>
-      <w:szCs w:val="28"/>
-    </w:rPr>
-  </w:style>
-  <w:style w:type="paragraph" w:styleId="fst5p9">
-    <w:name w:val="heading 1"/>
-    <w:basedOn w:val="ablt93"/>
-    <w:next w:val="ablt93"/>
-    <w:uiPriority w:val="9"/>
-    <w:qFormat/>
-    <w:pPr>
-      <w:keepNext/>
-      <w:keepLines/>
-      <w:spacing w:before="0" w:after="0" w:line="408" w:lineRule="auto"/>
-      <w:outlineLvl w:val="0"/>
-    </w:pPr>
-    <w:rPr>
-      <w:b/>
-      <w:bCs/>
-      <w:color w:val="1A1A1A"/>
-      <w:sz w:val="36"/>
-      <w:szCs w:val="36"/>
-    </w:rPr>
-  </w:style>
-  <w:style w:type="paragraph" w:styleId="fqhxuo">
-    <w:name w:val="heading 3"/>
-    <w:basedOn w:val="ablt93"/>
-    <w:next w:val="ablt93"/>
-    <w:uiPriority w:val="9"/>
-    <w:qFormat/>
-    <w:pPr>
-      <w:keepNext/>
-      <w:keepLines/>
-      <w:spacing w:before="0" w:after="0" w:line="408" w:lineRule="auto"/>
-      <w:outlineLvl w:val="2"/>
-    </w:pPr>
-    <w:rPr>
-      <w:b/>
-      <w:bCs/>
-      <w:color w:val="1A1A1A"/>
-      <w:sz w:val="28"/>
-      <w:szCs w:val="28"/>
-    </w:rPr>
-  </w:style>
-  <w:style w:type="paragraph" w:styleId="anefa8">
-    <w:name w:val="heading 1"/>
-    <w:basedOn w:val="ablt93"/>
-    <w:next w:val="ablt93"/>
-    <w:uiPriority w:val="9"/>
-    <w:qFormat/>
-    <w:pPr>
-      <w:keepNext/>
-      <w:keepLines/>
-      <w:spacing w:before="0" w:after="0" w:line="408" w:lineRule="auto"/>
-      <w:outlineLvl w:val="0"/>
-    </w:pPr>
-    <w:rPr>
-      <w:b/>
-      <w:bCs/>
-      <w:color w:val="1A1A1A"/>
-      <w:sz w:val="36"/>
-      <w:szCs w:val="36"/>
-    </w:rPr>
-  </w:style>
-  <w:style w:type="paragraph" w:styleId="107i05">
-    <w:name w:val="heading 2"/>
-    <w:basedOn w:val="ablt93"/>
-    <w:next w:val="ablt93"/>
-    <w:uiPriority w:val="9"/>
-    <w:qFormat/>
-    <w:pPr>
-      <w:keepNext/>
-      <w:keepLines/>
-      <w:spacing w:before="0" w:after="0" w:line="408" w:lineRule="auto"/>
-      <w:outlineLvl w:val="1"/>
-    </w:pPr>
-    <w:rPr>
-      <w:b/>
-      <w:bCs/>
-      <w:color w:val="1A1A1A"/>
-      <w:sz w:val="32"/>
-      <w:szCs w:val="32"/>
-    </w:rPr>
-  </w:style>
-  <w:style w:type="paragraph" w:styleId="rdbvau">
-    <w:name w:val="Title"/>
-    <w:basedOn w:val="ablt93"/>
-    <w:next w:val="ablt93"/>
-    <w:uiPriority w:val="9"/>
-    <w:qFormat/>
-    <w:pPr>
-      <w:keepNext/>
-      <w:keepLines/>
-      <w:spacing w:before="0" w:after="0" w:line="408" w:lineRule="auto"/>
-      <w:jc w:val="center"/>
-      <w:outlineLvl w:val="0"/>
-    </w:pPr>
-    <w:rPr>
-      <w:b/>
-      <w:bCs/>
-      <w:color w:val="1A1A1A"/>
-      <w:sz w:val="48"/>
-      <w:szCs w:val="48"/>
-    </w:rPr>
-  </w:style>
-  <w:style w:type="paragraph" w:styleId="1hlbz2">
-    <w:name w:val="heading 3"/>
-    <w:basedOn w:val="ablt93"/>
-    <w:next w:val="ablt93"/>
-    <w:uiPriority w:val="9"/>
-    <w:qFormat/>
-    <w:pPr>
-      <w:keepNext/>
-      <w:keepLines/>
-      <w:spacing w:before="0" w:after="0" w:line="408" w:lineRule="auto"/>
-      <w:outlineLvl w:val="2"/>
-    </w:pPr>
-    <w:rPr>
-      <w:b/>
-      <w:bCs/>
-      <w:color w:val="1A1A1A"/>
-      <w:sz w:val="28"/>
-      <w:szCs w:val="28"/>
-    </w:rPr>
-  </w:style>
-  <w:style w:type="paragraph" w:styleId="lkcl5g">
-    <w:name w:val="heading 3"/>
-    <w:basedOn w:val="ablt93"/>
-    <w:next w:val="ablt93"/>
-    <w:uiPriority w:val="9"/>
-    <w:qFormat/>
-    <w:pPr>
-      <w:keepNext/>
-      <w:keepLines/>
-      <w:spacing w:before="0" w:after="0" w:line="408" w:lineRule="auto"/>
-      <w:outlineLvl w:val="2"/>
-    </w:pPr>
-    <w:rPr>
-      <w:b/>
-      <w:bCs/>
-      <w:color w:val="1A1A1A"/>
-      <w:sz w:val="28"/>
-      <w:szCs w:val="28"/>
-    </w:rPr>
-  </w:style>
-  <w:style w:type="table" w:styleId="gllumf" w:default="true">
-    <w:name w:val="Normal Table"/>
-    <w:basedOn w:val=""/>
-    <w:next w:val=""/>
-    <w:uiPriority w:val="99"/>
-    <w:semiHidden/>
-    <w:unhideWhenUsed/>
-    <w:tblPr>
-      <w:tblInd w:w="0" w:type="dxa"/>
-      <w:tblCellMar>
-        <w:top w:w="0" w:type="dxa"/>
-        <w:left w:w="108" w:type="dxa"/>
-        <w:bottom w:w="0" w:type="dxa"/>
-        <w:right w:w="108" w:type="dxa"/>
-      </w:tblCellMar>
-    </w:tblPr>
-  </w:style>
-  <w:style w:type="paragraph" w:styleId="yzns4d">
-    <w:name w:val="heading 3"/>
-    <w:basedOn w:val="ablt93"/>
-    <w:next w:val="ablt93"/>
-    <w:uiPriority w:val="9"/>
-    <w:qFormat/>
-    <w:pPr>
-      <w:keepNext/>
-      <w:keepLines/>
-      <w:spacing w:before="0" w:after="0" w:line="408" w:lineRule="auto"/>
-      <w:outlineLvl w:val="2"/>
-    </w:pPr>
-    <w:rPr>
-      <w:b/>
-      <w:bCs/>
-      <w:color w:val="1A1A1A"/>
-      <w:sz w:val="28"/>
-      <w:szCs w:val="28"/>
-    </w:rPr>
-  </w:style>
-  <w:style w:type="paragraph" w:styleId="jzqleg">
-    <w:name w:val="heading 2"/>
-    <w:basedOn w:val="ablt93"/>
-    <w:next w:val="ablt93"/>
-    <w:uiPriority w:val="9"/>
-    <w:qFormat/>
-    <w:pPr>
-      <w:keepNext/>
-      <w:keepLines/>
-      <w:spacing w:before="0" w:after="0" w:line="408" w:lineRule="auto"/>
-      <w:outlineLvl w:val="1"/>
-    </w:pPr>
-    <w:rPr>
-      <w:b/>
-      <w:bCs/>
-      <w:color w:val="1A1A1A"/>
-      <w:sz w:val="32"/>
-      <w:szCs w:val="32"/>
-    </w:rPr>
-  </w:style>
-  <w:style w:type="paragraph" w:styleId="vql9fw">
-    <w:name w:val="heading 2"/>
-    <w:basedOn w:val="ablt93"/>
-    <w:next w:val="ablt93"/>
-    <w:uiPriority w:val="9"/>
-    <w:qFormat/>
-    <w:pPr>
-      <w:keepNext/>
-      <w:keepLines/>
-      <w:spacing w:before="0" w:after="0" w:line="408" w:lineRule="auto"/>
-      <w:outlineLvl w:val="1"/>
-    </w:pPr>
-    <w:rPr>
-      <w:b/>
-      <w:bCs/>
-      <w:color w:val="1A1A1A"/>
-      <w:sz w:val="32"/>
-      <w:szCs w:val="32"/>
-    </w:rPr>
-  </w:style>
-  <w:style w:type="table" w:styleId="5owzcn">
-    <w:name w:val="Table Grid"/>
-    <w:basedOn w:val="3chtoc"/>
-    <w:next w:val=""/>
-    <w:uiPriority w:val="39"/>
-    <w:tblPr>
-      <w:tblBorders>
-        <w:top w:val="single" w:color="CBCDD1" w:sz="6" w:space="0"/>
-        <w:left w:val="single" w:color="CBCDD1" w:sz="6" w:space="0"/>
-        <w:bottom w:val="single" w:color="CBCDD1" w:sz="6" w:space="0"/>
-        <w:right w:val="single" w:color="CBCDD1" w:sz="6" w:space="0"/>
-        <w:insideH w:val="single" w:color="CBCDD1" w:sz="6" w:space="0"/>
-        <w:insideV w:val="single" w:color="CBCDD1" w:sz="6" w:space="0"/>
-      </w:tblBorders>
-    </w:tblPr>
-    <w:tcPr>
-      <w:vAlign w:val="center"/>
-    </w:tcPr>
-  </w:style>
-  <w:style w:type="paragraph" w:styleId="pqwr7t">
-    <w:name w:val="heading 2"/>
-    <w:basedOn w:val="ablt93"/>
-    <w:next w:val="ablt93"/>
-    <w:uiPriority w:val="9"/>
-    <w:qFormat/>
-    <w:pPr>
-      <w:keepNext/>
-      <w:keepLines/>
-      <w:spacing w:before="0" w:after="0" w:line="408" w:lineRule="auto"/>
-      <w:outlineLvl w:val="1"/>
-    </w:pPr>
-    <w:rPr>
-      <w:b/>
-      <w:bCs/>
-      <w:color w:val="1A1A1A"/>
-      <w:sz w:val="32"/>
-      <w:szCs w:val="32"/>
-    </w:rPr>
-  </w:style>
-  <w:style w:type="paragraph" w:styleId="i0ok5w">
-    <w:name w:val="heading 2"/>
-    <w:basedOn w:val="ablt93"/>
-    <w:next w:val="ablt93"/>
-    <w:uiPriority w:val="9"/>
-    <w:qFormat/>
-    <w:pPr>
-      <w:keepNext/>
-      <w:keepLines/>
-      <w:spacing w:before="0" w:after="0" w:line="408" w:lineRule="auto"/>
-      <w:outlineLvl w:val="1"/>
-    </w:pPr>
-    <w:rPr>
-      <w:b/>
-      <w:bCs/>
-      <w:color w:val="1A1A1A"/>
-      <w:sz w:val="32"/>
-      <w:szCs w:val="32"/>
-    </w:rPr>
-  </w:style>
-  <w:style w:type="paragraph" w:styleId="0yo7r5">
-    <w:name w:val="heading 2"/>
-    <w:basedOn w:val="ablt93"/>
-    <w:next w:val="ablt93"/>
-    <w:uiPriority w:val="9"/>
-    <w:qFormat/>
-    <w:pPr>
-      <w:keepNext/>
-      <w:keepLines/>
-      <w:spacing w:before="0" w:after="0" w:line="408" w:lineRule="auto"/>
-      <w:outlineLvl w:val="1"/>
-    </w:pPr>
-    <w:rPr>
-      <w:b/>
-      <w:bCs/>
-      <w:color w:val="1A1A1A"/>
-      <w:sz w:val="32"/>
-      <w:szCs w:val="32"/>
-    </w:rPr>
-  </w:style>
-  <w:style w:type="paragraph" w:styleId="m1ymqs">
-    <w:name w:val="heading 3"/>
-    <w:basedOn w:val="ablt93"/>
-    <w:next w:val="ablt93"/>
-    <w:uiPriority w:val="9"/>
-    <w:qFormat/>
-    <w:pPr>
-      <w:keepNext/>
-      <w:keepLines/>
-      <w:spacing w:before="0" w:after="0" w:line="408" w:lineRule="auto"/>
-      <w:outlineLvl w:val="2"/>
-    </w:pPr>
-    <w:rPr>
-      <w:b/>
-      <w:bCs/>
-      <w:color w:val="1A1A1A"/>
-      <w:sz w:val="28"/>
-      <w:szCs w:val="28"/>
-    </w:rPr>
-  </w:style>
-  <w:style w:type="paragraph" w:styleId="isgmia">
-    <w:name w:val="heading 1"/>
-    <w:basedOn w:val="ablt93"/>
-    <w:next w:val="ablt93"/>
-    <w:uiPriority w:val="9"/>
-    <w:qFormat/>
-    <w:pPr>
-      <w:keepNext/>
-      <w:keepLines/>
-      <w:spacing w:before="0" w:after="0" w:line="408" w:lineRule="auto"/>
-      <w:outlineLvl w:val="0"/>
-    </w:pPr>
-    <w:rPr>
-      <w:b/>
-      <w:bCs/>
-      <w:color w:val="1A1A1A"/>
-      <w:sz w:val="36"/>
-      <w:szCs w:val="36"/>
-    </w:rPr>
-  </w:style>
-  <w:style w:type="paragraph" w:styleId="ig2h0d">
-    <w:name w:val="heading 1"/>
-    <w:basedOn w:val="ablt93"/>
-    <w:next w:val="ablt93"/>
-    <w:uiPriority w:val="9"/>
-    <w:qFormat/>
-    <w:pPr>
-      <w:keepNext/>
-      <w:keepLines/>
-      <w:spacing w:before="0" w:after="0" w:line="408" w:lineRule="auto"/>
-      <w:outlineLvl w:val="0"/>
-    </w:pPr>
-    <w:rPr>
-      <w:b/>
-      <w:bCs/>
-      <w:color w:val="1A1A1A"/>
-      <w:sz w:val="36"/>
-      <w:szCs w:val="36"/>
-    </w:rPr>
-  </w:style>
-  <w:style w:type="paragraph" w:styleId="d6s8m3">
-    <w:name w:val="heading 3"/>
-    <w:basedOn w:val="ablt93"/>
-    <w:next w:val="ablt93"/>
-    <w:uiPriority w:val="9"/>
-    <w:qFormat/>
-    <w:pPr>
-      <w:keepNext/>
-      <w:keepLines/>
-      <w:spacing w:before="0" w:after="0" w:line="408" w:lineRule="auto"/>
-      <w:outlineLvl w:val="2"/>
-    </w:pPr>
-    <w:rPr>
-      <w:b/>
-      <w:bCs/>
-      <w:color w:val="1A1A1A"/>
-      <w:sz w:val="28"/>
-      <w:szCs w:val="28"/>
-    </w:rPr>
-  </w:style>
-  <w:style w:type="paragraph" w:styleId="ablt93" w:default="true">
-    <w:name w:val="Normal"/>
-    <w:pPr>
-      <w:widowControl w:val="false"/>
-      <w:jc w:val="left"/>
-    </w:pPr>
-  </w:style>
-  <w:style w:type="paragraph" w:styleId="om8cq1">
-    <w:name w:val="heading 1"/>
-    <w:basedOn w:val="ablt93"/>
-    <w:next w:val="ablt93"/>
-    <w:uiPriority w:val="9"/>
-    <w:qFormat/>
-    <w:pPr>
-      <w:keepNext/>
-      <w:keepLines/>
-      <w:spacing w:before="0" w:after="0" w:line="408" w:lineRule="auto"/>
-      <w:outlineLvl w:val="0"/>
-    </w:pPr>
-    <w:rPr>
-      <w:b/>
-      <w:bCs/>
-      <w:color w:val="1A1A1A"/>
-      <w:sz w:val="36"/>
-      <w:szCs w:val="36"/>
-    </w:rPr>
-  </w:style>
-  <w:style w:type="paragraph" w:styleId="4x3e13">
-    <w:name w:val="heading 1"/>
-    <w:basedOn w:val="ablt93"/>
-    <w:next w:val="ablt93"/>
-    <w:uiPriority w:val="9"/>
-    <w:qFormat/>
-    <w:pPr>
-      <w:keepNext/>
-      <w:keepLines/>
-      <w:spacing w:before="0" w:after="0" w:line="408" w:lineRule="auto"/>
-      <w:outlineLvl w:val="0"/>
-    </w:pPr>
-    <w:rPr>
-      <w:b/>
-      <w:bCs/>
-      <w:color w:val="1A1A1A"/>
-      <w:sz w:val="36"/>
-      <w:szCs w:val="36"/>
-    </w:rPr>
-  </w:style>
-  <w:style w:type="paragraph" w:styleId="8lvrr3">
-    <w:name w:val="heading 2"/>
-    <w:basedOn w:val="ablt93"/>
-    <w:next w:val="ablt93"/>
-    <w:uiPriority w:val="9"/>
-    <w:qFormat/>
-    <w:pPr>
-      <w:keepNext/>
-      <w:keepLines/>
-      <w:spacing w:before="0" w:after="0" w:line="408" w:lineRule="auto"/>
-      <w:outlineLvl w:val="1"/>
-    </w:pPr>
-    <w:rPr>
-      <w:b/>
-      <w:bCs/>
-      <w:color w:val="1A1A1A"/>
-      <w:sz w:val="32"/>
-      <w:szCs w:val="32"/>
-    </w:rPr>
-  </w:style>
-  <w:style w:type="paragraph" w:styleId="li8342">
-    <w:name w:val="heading 2"/>
-    <w:basedOn w:val="ablt93"/>
-    <w:next w:val="ablt93"/>
-    <w:uiPriority w:val="9"/>
-    <w:qFormat/>
-    <w:pPr>
-      <w:keepNext/>
-      <w:keepLines/>
-      <w:spacing w:before="0" w:after="0" w:line="408" w:lineRule="auto"/>
-      <w:outlineLvl w:val="1"/>
-    </w:pPr>
-    <w:rPr>
-      <w:b/>
-      <w:bCs/>
-      <w:color w:val="1A1A1A"/>
-      <w:sz w:val="32"/>
-      <w:szCs w:val="32"/>
-    </w:rPr>
-  </w:style>
-  <w:style w:type="paragraph" w:styleId="vx48nr">
-    <w:name w:val="heading 2"/>
-    <w:basedOn w:val="ablt93"/>
-    <w:next w:val="ablt93"/>
-    <w:uiPriority w:val="9"/>
-    <w:qFormat/>
-    <w:pPr>
-      <w:keepNext/>
-      <w:keepLines/>
-      <w:spacing w:before="0" w:after="0" w:line="408" w:lineRule="auto"/>
-      <w:outlineLvl w:val="1"/>
-    </w:pPr>
-    <w:rPr>
-      <w:b/>
-      <w:bCs/>
-      <w:color w:val="1A1A1A"/>
-      <w:sz w:val="32"/>
-      <w:szCs w:val="32"/>
-    </w:rPr>
-  </w:style>
-  <w:style w:type="table" w:styleId="guzlqc" w:default="true">
-    <w:name w:val="Normal Table"/>
-    <w:basedOn w:val=""/>
-    <w:next w:val=""/>
-    <w:uiPriority w:val="99"/>
-    <w:semiHidden/>
-    <w:unhideWhenUsed/>
-    <w:tblPr>
-      <w:tblInd w:w="0" w:type="dxa"/>
-      <w:tblCellMar>
-        <w:top w:w="0" w:type="dxa"/>
-        <w:left w:w="108" w:type="dxa"/>
-        <w:bottom w:w="0" w:type="dxa"/>
-        <w:right w:w="108" w:type="dxa"/>
-      </w:tblCellMar>
-    </w:tblPr>
-  </w:style>
-  <w:style w:type="paragraph" w:styleId="q4634k">
-    <w:name w:val="heading 2"/>
-    <w:basedOn w:val="ablt93"/>
-    <w:next w:val="ablt93"/>
-    <w:uiPriority w:val="9"/>
-    <w:qFormat/>
-    <w:pPr>
-      <w:keepNext/>
-      <w:keepLines/>
-      <w:spacing w:before="0" w:after="0" w:line="408" w:lineRule="auto"/>
-      <w:outlineLvl w:val="1"/>
-    </w:pPr>
-    <w:rPr>
-      <w:b/>
-      <w:bCs/>
-      <w:color w:val="1A1A1A"/>
-      <w:sz w:val="32"/>
-      <w:szCs w:val="32"/>
-    </w:rPr>
-  </w:style>
-  <w:style w:type="paragraph" w:styleId="cnhf1q">
-    <w:name w:val="heading 2"/>
-    <w:basedOn w:val="ablt93"/>
-    <w:next w:val="ablt93"/>
-    <w:uiPriority w:val="9"/>
-    <w:qFormat/>
-    <w:pPr>
-      <w:keepNext/>
-      <w:keepLines/>
-      <w:spacing w:before="0" w:after="0" w:line="408" w:lineRule="auto"/>
-      <w:outlineLvl w:val="1"/>
-    </w:pPr>
-    <w:rPr>
-      <w:b/>
-      <w:bCs/>
-      <w:color w:val="1A1A1A"/>
-      <w:sz w:val="32"/>
-      <w:szCs w:val="32"/>
-    </w:rPr>
-  </w:style>
-  <w:style w:type="table" w:styleId="nn7qvs">
-    <w:name w:val="Table Grid"/>
-    <w:basedOn w:val="gllumf"/>
-    <w:next w:val=""/>
-    <w:uiPriority w:val="39"/>
-    <w:tblPr>
-      <w:tblBorders>
-        <w:top w:val="single" w:color="CBCDD1" w:sz="6" w:space="0"/>
-        <w:left w:val="single" w:color="CBCDD1" w:sz="6" w:space="0"/>
-        <w:bottom w:val="single" w:color="CBCDD1" w:sz="6" w:space="0"/>
-        <w:right w:val="single" w:color="CBCDD1" w:sz="6" w:space="0"/>
-        <w:insideH w:val="single" w:color="CBCDD1" w:sz="6" w:space="0"/>
-        <w:insideV w:val="single" w:color="CBCDD1" w:sz="6" w:space="0"/>
-      </w:tblBorders>
-    </w:tblPr>
-    <w:tcPr>
-      <w:vAlign w:val="center"/>
-    </w:tcPr>
-  </w:style>
-  <w:style w:type="paragraph" w:styleId="wxn7la">
-    <w:name w:val="heading 2"/>
-    <w:basedOn w:val="ablt93"/>
-    <w:next w:val="ablt93"/>
-    <w:uiPriority w:val="9"/>
-    <w:qFormat/>
-    <w:pPr>
-      <w:keepNext/>
-      <w:keepLines/>
-      <w:spacing w:before="0" w:after="0" w:line="408" w:lineRule="auto"/>
-      <w:outlineLvl w:val="1"/>
-    </w:pPr>
-    <w:rPr>
-      <w:b/>
-      <w:bCs/>
-      <w:color w:val="1A1A1A"/>
-      <w:sz w:val="32"/>
-      <w:szCs w:val="32"/>
-    </w:rPr>
-  </w:style>
-  <w:style w:type="paragraph" w:styleId="09unrc">
-    <w:name w:val="heading 1"/>
-    <w:basedOn w:val="ablt93"/>
-    <w:next w:val="ablt93"/>
-    <w:uiPriority w:val="9"/>
-    <w:qFormat/>
-    <w:pPr>
-      <w:keepNext/>
-      <w:keepLines/>
-      <w:spacing w:before="0" w:after="0" w:line="408" w:lineRule="auto"/>
-      <w:outlineLvl w:val="0"/>
-    </w:pPr>
-    <w:rPr>
-      <w:b/>
-      <w:bCs/>
-      <w:color w:val="1A1A1A"/>
-      <w:sz w:val="36"/>
-      <w:szCs w:val="36"/>
-    </w:rPr>
-  </w:style>
   <w:style w:type="table" w:styleId="3cijp3">
     <w:name w:val="Table Grid"/>
     <w:basedOn w:val="ehpslr"/>
@@ -4156,7 +4027,87 @@
       <w:vAlign w:val="center"/>
     </w:tcPr>
   </w:style>
-  <w:style w:type="paragraph" w:styleId="xv7hh4">
+  <w:style w:type="paragraph" w:styleId="li8342">
+    <w:name w:val="heading 2"/>
+    <w:basedOn w:val="ablt93"/>
+    <w:next w:val="ablt93"/>
+    <w:uiPriority w:val="9"/>
+    <w:qFormat/>
+    <w:pPr>
+      <w:keepNext/>
+      <w:keepLines/>
+      <w:spacing w:before="0" w:after="0" w:line="408" w:lineRule="auto"/>
+      <w:outlineLvl w:val="1"/>
+    </w:pPr>
+    <w:rPr>
+      <w:b/>
+      <w:bCs/>
+      <w:color w:val="1A1A1A"/>
+      <w:sz w:val="32"/>
+      <w:szCs w:val="32"/>
+    </w:rPr>
+  </w:style>
+  <w:style w:type="paragraph" w:styleId="lptxjf">
+    <w:name w:val="heading 1"/>
+    <w:basedOn w:val="ablt93"/>
+    <w:next w:val="ablt93"/>
+    <w:uiPriority w:val="9"/>
+    <w:qFormat/>
+    <w:pPr>
+      <w:keepNext/>
+      <w:keepLines/>
+      <w:spacing w:before="0" w:after="0" w:line="408" w:lineRule="auto"/>
+      <w:outlineLvl w:val="0"/>
+    </w:pPr>
+    <w:rPr>
+      <w:b/>
+      <w:bCs/>
+      <w:color w:val="1A1A1A"/>
+      <w:sz w:val="36"/>
+      <w:szCs w:val="36"/>
+    </w:rPr>
+  </w:style>
+  <w:style w:type="paragraph" w:styleId="jzqleg">
+    <w:name w:val="heading 2"/>
+    <w:basedOn w:val="ablt93"/>
+    <w:next w:val="ablt93"/>
+    <w:uiPriority w:val="9"/>
+    <w:qFormat/>
+    <w:pPr>
+      <w:keepNext/>
+      <w:keepLines/>
+      <w:spacing w:before="0" w:after="0" w:line="408" w:lineRule="auto"/>
+      <w:outlineLvl w:val="1"/>
+    </w:pPr>
+    <w:rPr>
+      <w:b/>
+      <w:bCs/>
+      <w:color w:val="1A1A1A"/>
+      <w:sz w:val="32"/>
+      <w:szCs w:val="32"/>
+    </w:rPr>
+  </w:style>
+  <w:style w:type="paragraph" w:styleId="ou0r7i">
+    <w:name w:val="heading 1"/>
+    <w:basedOn w:val="ablt93"/>
+    <w:next w:val="ablt93"/>
+    <w:uiPriority w:val="9"/>
+    <w:qFormat/>
+    <w:pPr>
+      <w:keepNext/>
+      <w:keepLines/>
+      <w:spacing w:before="0" w:after="0" w:line="408" w:lineRule="auto"/>
+      <w:outlineLvl w:val="0"/>
+    </w:pPr>
+    <w:rPr>
+      <w:b/>
+      <w:bCs/>
+      <w:color w:val="1A1A1A"/>
+      <w:sz w:val="36"/>
+      <w:szCs w:val="36"/>
+    </w:rPr>
+  </w:style>
+  <w:style w:type="paragraph" w:styleId="lkcl5g">
     <w:name w:val="heading 3"/>
     <w:basedOn w:val="ablt93"/>
     <w:next w:val="ablt93"/>
@@ -4176,24 +4127,73 @@
       <w:szCs w:val="28"/>
     </w:rPr>
   </w:style>
-  <w:style w:type="table" w:styleId="ve86m4">
-    <w:name w:val="Table Grid"/>
-    <w:basedOn w:val="z5a0lc"/>
-    <w:next w:val=""/>
-    <w:uiPriority w:val="39"/>
-    <w:tblPr>
-      <w:tblBorders>
-        <w:top w:val="single" w:color="CBCDD1" w:sz="6" w:space="0"/>
-        <w:left w:val="single" w:color="CBCDD1" w:sz="6" w:space="0"/>
-        <w:bottom w:val="single" w:color="CBCDD1" w:sz="6" w:space="0"/>
-        <w:right w:val="single" w:color="CBCDD1" w:sz="6" w:space="0"/>
-        <w:insideH w:val="single" w:color="CBCDD1" w:sz="6" w:space="0"/>
-        <w:insideV w:val="single" w:color="CBCDD1" w:sz="6" w:space="0"/>
-      </w:tblBorders>
-    </w:tblPr>
-    <w:tcPr>
-      <w:vAlign w:val="center"/>
-    </w:tcPr>
+  <w:style w:type="paragraph" w:styleId="rdbvau">
+    <w:name w:val="Title"/>
+    <w:basedOn w:val="ablt93"/>
+    <w:next w:val="ablt93"/>
+    <w:uiPriority w:val="9"/>
+    <w:qFormat/>
+    <w:pPr>
+      <w:keepNext/>
+      <w:keepLines/>
+      <w:spacing w:before="0" w:after="0" w:line="408" w:lineRule="auto"/>
+      <w:jc w:val="center"/>
+      <w:outlineLvl w:val="0"/>
+    </w:pPr>
+    <w:rPr>
+      <w:b/>
+      <w:bCs/>
+      <w:color w:val="1A1A1A"/>
+      <w:sz w:val="48"/>
+      <w:szCs w:val="48"/>
+    </w:rPr>
+  </w:style>
+  <w:style w:type="paragraph" w:styleId="ablt93" w:default="true">
+    <w:name w:val="Normal"/>
+    <w:pPr>
+      <w:widowControl w:val="false"/>
+      <w:jc w:val="left"/>
+    </w:pPr>
+  </w:style>
+  <w:style w:type="paragraph" w:styleId="8lvrr3">
+    <w:name w:val="heading 2"/>
+    <w:basedOn w:val="ablt93"/>
+    <w:next w:val="ablt93"/>
+    <w:uiPriority w:val="9"/>
+    <w:qFormat/>
+    <w:pPr>
+      <w:keepNext/>
+      <w:keepLines/>
+      <w:spacing w:before="0" w:after="0" w:line="408" w:lineRule="auto"/>
+      <w:outlineLvl w:val="1"/>
+    </w:pPr>
+    <w:rPr>
+      <w:b/>
+      <w:bCs/>
+      <w:color w:val="1A1A1A"/>
+      <w:sz w:val="32"/>
+      <w:szCs w:val="32"/>
+    </w:rPr>
+  </w:style>
+  <w:style w:type="paragraph" w:styleId="xv7hh4">
+    <w:name w:val="heading 3"/>
+    <w:basedOn w:val="ablt93"/>
+    <w:next w:val="ablt93"/>
+    <w:uiPriority w:val="9"/>
+    <w:qFormat/>
+    <w:pPr>
+      <w:keepNext/>
+      <w:keepLines/>
+      <w:spacing w:before="0" w:after="0" w:line="408" w:lineRule="auto"/>
+      <w:outlineLvl w:val="2"/>
+    </w:pPr>
+    <w:rPr>
+      <w:b/>
+      <w:bCs/>
+      <w:color w:val="1A1A1A"/>
+      <w:sz w:val="28"/>
+      <w:szCs w:val="28"/>
+    </w:rPr>
   </w:style>
 </w:styles>
 </file>
</xml_diff>